<commit_message>
Update Project 4 what-was-implemented overview.
Co-authored-by: Cursor <cursoragent@cursor.com>
</commit_message>
<xml_diff>
--- a/project-4-cicd/docs/Project 4 – What was Implemented.docx
+++ b/project-4-cicd/docs/Project 4 – What was Implemented.docx
@@ -4,14 +4,871 @@
   <w:body>
     <w:p>
       <w:pPr>
+        <w:pStyle w:val="Title"/>
         <w:jc w:val="center"/>
-      </w:pPr>
-      <w:r>
+        <w:rPr>
+          <w:sz w:val="30"/>
+          <w:szCs w:val="30"/>
+        </w:rPr>
+      </w:pPr>
+      <w:r>
+        <w:rPr>
+          <w:sz w:val="30"/>
+          <w:szCs w:val="30"/>
+        </w:rPr>
         <w:t>Project 4 – What was Implemented</w:t>
       </w:r>
     </w:p>
-    <w:p/>
-    <w:p/>
+    <w:sdt>
+      <w:sdtPr>
+        <w:id w:val="-922792865"/>
+        <w:docPartObj>
+          <w:docPartGallery w:val="Table of Contents"/>
+          <w:docPartUnique/>
+        </w:docPartObj>
+      </w:sdtPr>
+      <w:sdtEndPr>
+        <w:rPr>
+          <w:rFonts w:asciiTheme="minorHAnsi" w:eastAsiaTheme="minorHAnsi" w:hAnsiTheme="minorHAnsi" w:cstheme="minorBidi"/>
+          <w:b/>
+          <w:bCs/>
+          <w:noProof/>
+          <w:color w:val="auto"/>
+          <w:kern w:val="2"/>
+          <w:sz w:val="24"/>
+          <w:szCs w:val="24"/>
+          <w14:ligatures w14:val="standardContextual"/>
+        </w:rPr>
+      </w:sdtEndPr>
+      <w:sdtContent>
+        <w:p>
+          <w:pPr>
+            <w:pStyle w:val="TOCHeading"/>
+          </w:pPr>
+          <w:r>
+            <w:t>Table of Contents</w:t>
+          </w:r>
+        </w:p>
+        <w:p>
+          <w:pPr>
+            <w:pStyle w:val="TOC1"/>
+            <w:tabs>
+              <w:tab w:val="right" w:leader="dot" w:pos="9350"/>
+            </w:tabs>
+            <w:rPr>
+              <w:noProof/>
+            </w:rPr>
+          </w:pPr>
+          <w:r>
+            <w:fldChar w:fldCharType="begin"/>
+          </w:r>
+          <w:r>
+            <w:instrText xml:space="preserve"> TOC \o "1-3" \h \z \u </w:instrText>
+          </w:r>
+          <w:r>
+            <w:fldChar w:fldCharType="separate"/>
+          </w:r>
+          <w:hyperlink w:anchor="_Toc236537386" w:history="1">
+            <w:r>
+              <w:rPr>
+                <w:rStyle w:val="Hyperlink"/>
+                <w:noProof/>
+              </w:rPr>
+              <w:t>Overview</w:t>
+            </w:r>
+            <w:r>
+              <w:rPr>
+                <w:noProof/>
+                <w:webHidden/>
+              </w:rPr>
+              <w:tab/>
+            </w:r>
+            <w:r>
+              <w:rPr>
+                <w:noProof/>
+                <w:webHidden/>
+              </w:rPr>
+              <w:fldChar w:fldCharType="begin"/>
+            </w:r>
+            <w:r>
+              <w:rPr>
+                <w:noProof/>
+                <w:webHidden/>
+              </w:rPr>
+              <w:instrText xml:space="preserve"> PAGEREF _Toc236537386 \h </w:instrText>
+            </w:r>
+            <w:r>
+              <w:rPr>
+                <w:noProof/>
+                <w:webHidden/>
+              </w:rPr>
+            </w:r>
+            <w:r>
+              <w:rPr>
+                <w:noProof/>
+                <w:webHidden/>
+              </w:rPr>
+              <w:fldChar w:fldCharType="separate"/>
+            </w:r>
+            <w:r>
+              <w:rPr>
+                <w:noProof/>
+                <w:webHidden/>
+              </w:rPr>
+              <w:t>1</w:t>
+            </w:r>
+            <w:r>
+              <w:rPr>
+                <w:noProof/>
+                <w:webHidden/>
+              </w:rPr>
+              <w:fldChar w:fldCharType="end"/>
+            </w:r>
+          </w:hyperlink>
+        </w:p>
+        <w:p>
+          <w:pPr>
+            <w:pStyle w:val="TOC1"/>
+            <w:tabs>
+              <w:tab w:val="right" w:leader="dot" w:pos="9350"/>
+            </w:tabs>
+            <w:rPr>
+              <w:noProof/>
+            </w:rPr>
+          </w:pPr>
+          <w:hyperlink w:anchor="_Toc236537387" w:history="1">
+            <w:r>
+              <w:rPr>
+                <w:rStyle w:val="Hyperlink"/>
+                <w:noProof/>
+              </w:rPr>
+              <w:t>Pipeline</w:t>
+            </w:r>
+            <w:r>
+              <w:rPr>
+                <w:noProof/>
+                <w:webHidden/>
+              </w:rPr>
+              <w:tab/>
+            </w:r>
+            <w:r>
+              <w:rPr>
+                <w:noProof/>
+                <w:webHidden/>
+              </w:rPr>
+              <w:fldChar w:fldCharType="begin"/>
+            </w:r>
+            <w:r>
+              <w:rPr>
+                <w:noProof/>
+                <w:webHidden/>
+              </w:rPr>
+              <w:instrText xml:space="preserve"> PAGEREF _Toc236537387 \h </w:instrText>
+            </w:r>
+            <w:r>
+              <w:rPr>
+                <w:noProof/>
+                <w:webHidden/>
+              </w:rPr>
+            </w:r>
+            <w:r>
+              <w:rPr>
+                <w:noProof/>
+                <w:webHidden/>
+              </w:rPr>
+              <w:fldChar w:fldCharType="separate"/>
+            </w:r>
+            <w:r>
+              <w:rPr>
+                <w:noProof/>
+                <w:webHidden/>
+              </w:rPr>
+              <w:t>1</w:t>
+            </w:r>
+            <w:r>
+              <w:rPr>
+                <w:noProof/>
+                <w:webHidden/>
+              </w:rPr>
+              <w:fldChar w:fldCharType="end"/>
+            </w:r>
+          </w:hyperlink>
+        </w:p>
+        <w:p>
+          <w:pPr>
+            <w:pStyle w:val="TOC1"/>
+            <w:tabs>
+              <w:tab w:val="right" w:leader="dot" w:pos="9350"/>
+            </w:tabs>
+            <w:rPr>
+              <w:noProof/>
+            </w:rPr>
+          </w:pPr>
+          <w:hyperlink w:anchor="_Toc236537388" w:history="1">
+            <w:r>
+              <w:rPr>
+                <w:rStyle w:val="Hyperlink"/>
+                <w:noProof/>
+              </w:rPr>
+              <w:t>Build / Deploy</w:t>
+            </w:r>
+            <w:r>
+              <w:rPr>
+                <w:noProof/>
+                <w:webHidden/>
+              </w:rPr>
+              <w:tab/>
+            </w:r>
+            <w:r>
+              <w:rPr>
+                <w:noProof/>
+                <w:webHidden/>
+              </w:rPr>
+              <w:fldChar w:fldCharType="begin"/>
+            </w:r>
+            <w:r>
+              <w:rPr>
+                <w:noProof/>
+                <w:webHidden/>
+              </w:rPr>
+              <w:instrText xml:space="preserve"> PAGEREF _Toc236537388 \h </w:instrText>
+            </w:r>
+            <w:r>
+              <w:rPr>
+                <w:noProof/>
+                <w:webHidden/>
+              </w:rPr>
+            </w:r>
+            <w:r>
+              <w:rPr>
+                <w:noProof/>
+                <w:webHidden/>
+              </w:rPr>
+              <w:fldChar w:fldCharType="separate"/>
+            </w:r>
+            <w:r>
+              <w:rPr>
+                <w:noProof/>
+                <w:webHidden/>
+              </w:rPr>
+              <w:t>1</w:t>
+            </w:r>
+            <w:r>
+              <w:rPr>
+                <w:noProof/>
+                <w:webHidden/>
+              </w:rPr>
+              <w:fldChar w:fldCharType="end"/>
+            </w:r>
+          </w:hyperlink>
+        </w:p>
+        <w:p>
+          <w:pPr>
+            <w:pStyle w:val="TOC1"/>
+            <w:tabs>
+              <w:tab w:val="right" w:leader="dot" w:pos="9350"/>
+            </w:tabs>
+            <w:rPr>
+              <w:noProof/>
+            </w:rPr>
+          </w:pPr>
+          <w:hyperlink w:anchor="_Toc236537389" w:history="1">
+            <w:r>
+              <w:rPr>
+                <w:rStyle w:val="Hyperlink"/>
+                <w:noProof/>
+              </w:rPr>
+              <w:t>Supporting AWS Pieces</w:t>
+            </w:r>
+            <w:r>
+              <w:rPr>
+                <w:noProof/>
+                <w:webHidden/>
+              </w:rPr>
+              <w:tab/>
+            </w:r>
+            <w:r>
+              <w:rPr>
+                <w:noProof/>
+                <w:webHidden/>
+              </w:rPr>
+              <w:fldChar w:fldCharType="begin"/>
+            </w:r>
+            <w:r>
+              <w:rPr>
+                <w:noProof/>
+                <w:webHidden/>
+              </w:rPr>
+              <w:instrText xml:space="preserve"> PAGEREF _Toc236537389 \h </w:instrText>
+            </w:r>
+            <w:r>
+              <w:rPr>
+                <w:noProof/>
+                <w:webHidden/>
+              </w:rPr>
+            </w:r>
+            <w:r>
+              <w:rPr>
+                <w:noProof/>
+                <w:webHidden/>
+              </w:rPr>
+              <w:fldChar w:fldCharType="separate"/>
+            </w:r>
+            <w:r>
+              <w:rPr>
+                <w:noProof/>
+                <w:webHidden/>
+              </w:rPr>
+              <w:t>1</w:t>
+            </w:r>
+            <w:r>
+              <w:rPr>
+                <w:noProof/>
+                <w:webHidden/>
+              </w:rPr>
+              <w:fldChar w:fldCharType="end"/>
+            </w:r>
+          </w:hyperlink>
+        </w:p>
+        <w:p>
+          <w:pPr>
+            <w:pStyle w:val="TOC1"/>
+            <w:tabs>
+              <w:tab w:val="right" w:leader="dot" w:pos="9350"/>
+            </w:tabs>
+            <w:rPr>
+              <w:noProof/>
+            </w:rPr>
+          </w:pPr>
+          <w:hyperlink w:anchor="_Toc236537390" w:history="1">
+            <w:r>
+              <w:rPr>
+                <w:rStyle w:val="Hyperlink"/>
+                <w:noProof/>
+              </w:rPr>
+              <w:t>Terraform / docs</w:t>
+            </w:r>
+            <w:r>
+              <w:rPr>
+                <w:noProof/>
+                <w:webHidden/>
+              </w:rPr>
+              <w:tab/>
+            </w:r>
+            <w:r>
+              <w:rPr>
+                <w:noProof/>
+                <w:webHidden/>
+              </w:rPr>
+              <w:fldChar w:fldCharType="begin"/>
+            </w:r>
+            <w:r>
+              <w:rPr>
+                <w:noProof/>
+                <w:webHidden/>
+              </w:rPr>
+              <w:instrText xml:space="preserve"> PAGEREF _Toc236537390 \h </w:instrText>
+            </w:r>
+            <w:r>
+              <w:rPr>
+                <w:noProof/>
+                <w:webHidden/>
+              </w:rPr>
+            </w:r>
+            <w:r>
+              <w:rPr>
+                <w:noProof/>
+                <w:webHidden/>
+              </w:rPr>
+              <w:fldChar w:fldCharType="separate"/>
+            </w:r>
+            <w:r>
+              <w:rPr>
+                <w:noProof/>
+                <w:webHidden/>
+              </w:rPr>
+              <w:t>2</w:t>
+            </w:r>
+            <w:r>
+              <w:rPr>
+                <w:noProof/>
+                <w:webHidden/>
+              </w:rPr>
+              <w:fldChar w:fldCharType="end"/>
+            </w:r>
+          </w:hyperlink>
+        </w:p>
+        <w:p>
+          <w:pPr>
+            <w:pStyle w:val="TOC1"/>
+            <w:tabs>
+              <w:tab w:val="right" w:leader="dot" w:pos="9350"/>
+            </w:tabs>
+            <w:rPr>
+              <w:noProof/>
+            </w:rPr>
+          </w:pPr>
+          <w:hyperlink w:anchor="_Toc236537391" w:history="1">
+            <w:r>
+              <w:rPr>
+                <w:rStyle w:val="Hyperlink"/>
+                <w:noProof/>
+              </w:rPr>
+              <w:t>Relationship to Project 3</w:t>
+            </w:r>
+            <w:r>
+              <w:rPr>
+                <w:noProof/>
+                <w:webHidden/>
+              </w:rPr>
+              <w:tab/>
+            </w:r>
+            <w:r>
+              <w:rPr>
+                <w:noProof/>
+                <w:webHidden/>
+              </w:rPr>
+              <w:fldChar w:fldCharType="begin"/>
+            </w:r>
+            <w:r>
+              <w:rPr>
+                <w:noProof/>
+                <w:webHidden/>
+              </w:rPr>
+              <w:instrText xml:space="preserve"> PAGEREF _Toc236537391 \h </w:instrText>
+            </w:r>
+            <w:r>
+              <w:rPr>
+                <w:noProof/>
+                <w:webHidden/>
+              </w:rPr>
+            </w:r>
+            <w:r>
+              <w:rPr>
+                <w:noProof/>
+                <w:webHidden/>
+              </w:rPr>
+              <w:fldChar w:fldCharType="separate"/>
+            </w:r>
+            <w:r>
+              <w:rPr>
+                <w:noProof/>
+                <w:webHidden/>
+              </w:rPr>
+              <w:t>2</w:t>
+            </w:r>
+            <w:r>
+              <w:rPr>
+                <w:noProof/>
+                <w:webHidden/>
+              </w:rPr>
+              <w:fldChar w:fldCharType="end"/>
+            </w:r>
+          </w:hyperlink>
+        </w:p>
+        <w:p>
+          <w:r>
+            <w:rPr>
+              <w:b/>
+              <w:bCs/>
+              <w:noProof/>
+            </w:rPr>
+            <w:fldChar w:fldCharType="end"/>
+          </w:r>
+        </w:p>
+      </w:sdtContent>
+    </w:sdt>
+    <w:p>
+      <w:pPr>
+        <w:pStyle w:val="Heading1"/>
+        <w:rPr>
+          <w:sz w:val="30"/>
+          <w:szCs w:val="30"/>
+        </w:rPr>
+      </w:pPr>
+      <w:bookmarkStart w:id="0" w:name="_Toc236537386"/>
+      <w:r>
+        <w:rPr>
+          <w:sz w:val="30"/>
+          <w:szCs w:val="30"/>
+        </w:rPr>
+        <w:t>Overview</w:t>
+      </w:r>
+      <w:bookmarkEnd w:id="0"/>
+    </w:p>
+    <w:p>
+      <w:r>
+        <w:t xml:space="preserve">Built an AWS CI/CD pipeline with </w:t>
+      </w:r>
+      <w:proofErr w:type="spellStart"/>
+      <w:r>
+        <w:t>CodePipeline</w:t>
+      </w:r>
+      <w:proofErr w:type="spellEnd"/>
+      <w:r>
+        <w:t xml:space="preserve"> and </w:t>
+      </w:r>
+      <w:proofErr w:type="spellStart"/>
+      <w:r>
+        <w:t>CodeBuild</w:t>
+      </w:r>
+      <w:proofErr w:type="spellEnd"/>
+      <w:r>
+        <w:t xml:space="preserve"> that deploys the Project 3 static site to S3 and invalidates CloudFront on every push to main. GitHub is connected via </w:t>
+      </w:r>
+      <w:proofErr w:type="spellStart"/>
+      <w:r>
+        <w:t>CodeStar</w:t>
+      </w:r>
+      <w:proofErr w:type="spellEnd"/>
+      <w:r>
+        <w:t xml:space="preserve"> Connections; pipeline success was verified with live site updates.</w:t>
+      </w:r>
+    </w:p>
+    <w:p>
+      <w:pPr>
+        <w:pStyle w:val="Heading1"/>
+        <w:rPr>
+          <w:sz w:val="30"/>
+          <w:szCs w:val="30"/>
+        </w:rPr>
+      </w:pPr>
+      <w:bookmarkStart w:id="1" w:name="_Toc236537387"/>
+      <w:r>
+        <w:rPr>
+          <w:sz w:val="30"/>
+          <w:szCs w:val="30"/>
+        </w:rPr>
+        <w:t>Pipeline</w:t>
+      </w:r>
+      <w:bookmarkEnd w:id="1"/>
+    </w:p>
+    <w:p>
+      <w:pPr>
+        <w:pStyle w:val="ListParagraph"/>
+        <w:numPr>
+          <w:ilvl w:val="0"/>
+          <w:numId w:val="1"/>
+        </w:numPr>
+      </w:pPr>
+      <w:r>
+        <w:t xml:space="preserve">AWS </w:t>
+      </w:r>
+      <w:proofErr w:type="spellStart"/>
+      <w:r>
+        <w:t>CodePipeline</w:t>
+      </w:r>
+      <w:proofErr w:type="spellEnd"/>
+      <w:r>
+        <w:t xml:space="preserve"> with two stages: Source → Deploy</w:t>
+      </w:r>
+    </w:p>
+    <w:p>
+      <w:pPr>
+        <w:pStyle w:val="ListParagraph"/>
+        <w:numPr>
+          <w:ilvl w:val="0"/>
+          <w:numId w:val="1"/>
+        </w:numPr>
+      </w:pPr>
+      <w:r>
+        <w:t>Triggers on pushes to main in the GitHub Projects repo</w:t>
+      </w:r>
+    </w:p>
+    <w:p>
+      <w:pPr>
+        <w:pStyle w:val="ListParagraph"/>
+        <w:numPr>
+          <w:ilvl w:val="0"/>
+          <w:numId w:val="1"/>
+        </w:numPr>
+      </w:pPr>
+      <w:r>
+        <w:t>Triggers on pushes to main in the GitHub Projects repo</w:t>
+      </w:r>
+    </w:p>
+    <w:p>
+      <w:pPr>
+        <w:pStyle w:val="Heading1"/>
+        <w:rPr>
+          <w:sz w:val="30"/>
+          <w:szCs w:val="30"/>
+        </w:rPr>
+      </w:pPr>
+      <w:bookmarkStart w:id="2" w:name="_Toc236537388"/>
+      <w:r>
+        <w:rPr>
+          <w:sz w:val="30"/>
+          <w:szCs w:val="30"/>
+        </w:rPr>
+        <w:t>Build / Deploy</w:t>
+      </w:r>
+      <w:bookmarkEnd w:id="2"/>
+    </w:p>
+    <w:p>
+      <w:pPr>
+        <w:pStyle w:val="ListParagraph"/>
+        <w:numPr>
+          <w:ilvl w:val="0"/>
+          <w:numId w:val="2"/>
+        </w:numPr>
+      </w:pPr>
+      <w:r>
+        <w:t xml:space="preserve">AWS </w:t>
+      </w:r>
+      <w:proofErr w:type="spellStart"/>
+      <w:r>
+        <w:t>CodeBuild</w:t>
+      </w:r>
+      <w:proofErr w:type="spellEnd"/>
+      <w:r>
+        <w:t xml:space="preserve"> project runs project-4-cicd/</w:t>
+      </w:r>
+      <w:proofErr w:type="spellStart"/>
+      <w:r>
+        <w:t>buildspec.yml</w:t>
+      </w:r>
+      <w:proofErr w:type="spellEnd"/>
+    </w:p>
+    <w:p>
+      <w:pPr>
+        <w:pStyle w:val="ListParagraph"/>
+        <w:numPr>
+          <w:ilvl w:val="0"/>
+          <w:numId w:val="2"/>
+        </w:numPr>
+      </w:pPr>
+      <w:r>
+        <w:t>Syncs project-3-static</w:t>
+      </w:r>
+      <w:proofErr w:type="gramStart"/>
+      <w:r>
+        <w:t>-site/</w:t>
+      </w:r>
+      <w:proofErr w:type="gramEnd"/>
+      <w:r>
+        <w:t>site/ to the Project 3 S3 bucket (</w:t>
+      </w:r>
+      <w:proofErr w:type="spellStart"/>
+      <w:r>
+        <w:t>aws</w:t>
+      </w:r>
+      <w:proofErr w:type="spellEnd"/>
+      <w:r>
+        <w:t xml:space="preserve"> s3 sync --delete)</w:t>
+      </w:r>
+    </w:p>
+    <w:p>
+      <w:pPr>
+        <w:pStyle w:val="ListParagraph"/>
+        <w:numPr>
+          <w:ilvl w:val="0"/>
+          <w:numId w:val="2"/>
+        </w:numPr>
+      </w:pPr>
+      <w:r>
+        <w:t>Creates a CloudFront invalidation so updates show up quickly</w:t>
+      </w:r>
+    </w:p>
+    <w:p>
+      <w:pPr>
+        <w:pStyle w:val="Heading1"/>
+        <w:rPr>
+          <w:sz w:val="30"/>
+          <w:szCs w:val="30"/>
+        </w:rPr>
+      </w:pPr>
+      <w:bookmarkStart w:id="3" w:name="_Toc236537389"/>
+      <w:r>
+        <w:rPr>
+          <w:sz w:val="30"/>
+          <w:szCs w:val="30"/>
+        </w:rPr>
+        <w:t xml:space="preserve">Supporting AWS </w:t>
+      </w:r>
+      <w:r>
+        <w:rPr>
+          <w:sz w:val="30"/>
+          <w:szCs w:val="30"/>
+        </w:rPr>
+        <w:t>Pieces</w:t>
+      </w:r>
+      <w:bookmarkEnd w:id="3"/>
+    </w:p>
+    <w:p>
+      <w:pPr>
+        <w:pStyle w:val="ListParagraph"/>
+        <w:numPr>
+          <w:ilvl w:val="0"/>
+          <w:numId w:val="3"/>
+        </w:numPr>
+      </w:pPr>
+      <w:r>
+        <w:t>Private S3 artifacts bucket for pipeline artifacts (encryption + public access blocked)</w:t>
+      </w:r>
+    </w:p>
+    <w:p>
+      <w:pPr>
+        <w:pStyle w:val="ListParagraph"/>
+        <w:numPr>
+          <w:ilvl w:val="0"/>
+          <w:numId w:val="3"/>
+        </w:numPr>
+      </w:pPr>
+      <w:r>
+        <w:t xml:space="preserve">IAM roles for </w:t>
+      </w:r>
+      <w:proofErr w:type="spellStart"/>
+      <w:r>
+        <w:t>CodePipeline</w:t>
+      </w:r>
+      <w:proofErr w:type="spellEnd"/>
+      <w:r>
+        <w:t xml:space="preserve"> and </w:t>
+      </w:r>
+      <w:proofErr w:type="spellStart"/>
+      <w:r>
+        <w:t>CodeBuild</w:t>
+      </w:r>
+      <w:proofErr w:type="spellEnd"/>
+      <w:r>
+        <w:t xml:space="preserve"> with least-privilege access (artifacts, start build, use connection, site bucket deploy, CloudFront invalidation, logs)</w:t>
+      </w:r>
+    </w:p>
+    <w:p>
+      <w:pPr>
+        <w:pStyle w:val="Heading1"/>
+        <w:rPr>
+          <w:sz w:val="30"/>
+          <w:szCs w:val="30"/>
+        </w:rPr>
+      </w:pPr>
+      <w:bookmarkStart w:id="4" w:name="_Toc236537390"/>
+      <w:r>
+        <w:rPr>
+          <w:sz w:val="30"/>
+          <w:szCs w:val="30"/>
+        </w:rPr>
+        <w:t>Terraform / docs</w:t>
+      </w:r>
+      <w:bookmarkEnd w:id="4"/>
+    </w:p>
+    <w:p>
+      <w:pPr>
+        <w:pStyle w:val="ListParagraph"/>
+        <w:numPr>
+          <w:ilvl w:val="0"/>
+          <w:numId w:val="4"/>
+        </w:numPr>
+      </w:pPr>
+      <w:r>
+        <w:t xml:space="preserve">Pipeline, </w:t>
+      </w:r>
+      <w:proofErr w:type="spellStart"/>
+      <w:r>
+        <w:t>CodeBuild</w:t>
+      </w:r>
+      <w:proofErr w:type="spellEnd"/>
+      <w:r>
+        <w:t>, IAM, artifacts bucket, and connection defined in Terraform</w:t>
+      </w:r>
+    </w:p>
+    <w:p>
+      <w:pPr>
+        <w:pStyle w:val="ListParagraph"/>
+        <w:numPr>
+          <w:ilvl w:val="0"/>
+          <w:numId w:val="4"/>
+        </w:numPr>
+      </w:pPr>
+      <w:r>
+        <w:lastRenderedPageBreak/>
+        <w:t>Architecture doc + milestone screenshots + What was Implemented overview</w:t>
+      </w:r>
+    </w:p>
+    <w:p>
+      <w:pPr>
+        <w:pStyle w:val="ListParagraph"/>
+        <w:numPr>
+          <w:ilvl w:val="0"/>
+          <w:numId w:val="4"/>
+        </w:numPr>
+      </w:pPr>
+      <w:r>
+        <w:t xml:space="preserve">Verified with a live </w:t>
+      </w:r>
+      <w:proofErr w:type="gramStart"/>
+      <w:r>
+        <w:t>deploy:</w:t>
+      </w:r>
+      <w:proofErr w:type="gramEnd"/>
+      <w:r>
+        <w:t xml:space="preserve"> site text updated after a GitHub push</w:t>
+      </w:r>
+    </w:p>
+    <w:p>
+      <w:pPr>
+        <w:pStyle w:val="Heading1"/>
+        <w:rPr>
+          <w:sz w:val="30"/>
+          <w:szCs w:val="30"/>
+        </w:rPr>
+      </w:pPr>
+      <w:bookmarkStart w:id="5" w:name="_Toc236537391"/>
+      <w:r>
+        <w:rPr>
+          <w:sz w:val="30"/>
+          <w:szCs w:val="30"/>
+        </w:rPr>
+        <w:t xml:space="preserve">Relationship </w:t>
+      </w:r>
+      <w:proofErr w:type="gramStart"/>
+      <w:r>
+        <w:rPr>
+          <w:sz w:val="30"/>
+          <w:szCs w:val="30"/>
+        </w:rPr>
+        <w:t>to</w:t>
+      </w:r>
+      <w:proofErr w:type="gramEnd"/>
+      <w:r>
+        <w:rPr>
+          <w:sz w:val="30"/>
+          <w:szCs w:val="30"/>
+        </w:rPr>
+        <w:t xml:space="preserve"> Project 3</w:t>
+      </w:r>
+      <w:bookmarkEnd w:id="5"/>
+    </w:p>
+    <w:p>
+      <w:pPr>
+        <w:pStyle w:val="ListParagraph"/>
+        <w:numPr>
+          <w:ilvl w:val="0"/>
+          <w:numId w:val="5"/>
+        </w:numPr>
+      </w:pPr>
+      <w:r>
+        <w:t>Project 3 owns the live site (S3 + CloudFront + counter)</w:t>
+      </w:r>
+    </w:p>
+    <w:p>
+      <w:pPr>
+        <w:pStyle w:val="ListParagraph"/>
+        <w:numPr>
+          <w:ilvl w:val="0"/>
+          <w:numId w:val="5"/>
+        </w:numPr>
+      </w:pPr>
+      <w:r>
+        <w:t>Project 4 only automates deploying into that site</w:t>
+      </w:r>
+    </w:p>
+    <w:p>
+      <w:pPr>
+        <w:pStyle w:val="ListParagraph"/>
+      </w:pPr>
+    </w:p>
     <w:sectPr>
       <w:pgSz w:w="12240" w:h="15840"/>
       <w:pgMar w:top="1440" w:right="1440" w:bottom="1440" w:left="1440" w:header="720" w:footer="720" w:gutter="0"/>
@@ -20,6 +877,591 @@
     </w:sectPr>
   </w:body>
 </w:document>
+</file>
+
+<file path=word/numbering.xml><?xml version="1.0" encoding="utf-8"?>
+<w:numbering xmlns:wpc="http://schemas.microsoft.com/office/word/2010/wordprocessingCanvas" xmlns:cx="http://schemas.microsoft.com/office/drawing/2014/chartex" xmlns:cx1="http://schemas.microsoft.com/office/drawing/2015/9/8/chartex" xmlns:cx2="http://schemas.microsoft.com/office/drawing/2015/10/21/chartex" xmlns:cx3="http://schemas.microsoft.com/office/drawing/2016/5/9/chartex" xmlns:cx4="http://schemas.microsoft.com/office/drawing/2016/5/10/chartex" xmlns:cx5="http://schemas.microsoft.com/office/drawing/2016/5/11/chartex" xmlns:cx6="http://schemas.microsoft.com/office/drawing/2016/5/12/chartex" xmlns:cx7="http://schemas.microsoft.com/office/drawing/2016/5/13/chartex" xmlns:cx8="http://schemas.microsoft.com/office/drawing/2016/5/14/chartex" xmlns:mc="http://schemas.openxmlformats.org/markup-compatibility/2006" xmlns:aink="http://schemas.microsoft.com/office/drawing/2016/ink" xmlns:am3d="http://schemas.microsoft.com/office/drawing/2017/model3d" xmlns:o="urn:schemas-microsoft-com:office:office" xmlns:oel="http://schemas.microsoft.com/office/2019/extlst" xmlns:r="http://schemas.openxmlformats.org/officeDocument/2006/relationships" xmlns:m="http://schemas.openxmlformats.org/officeDocument/2006/math" xmlns:v="urn:schemas-microsoft-com:vml" xmlns:wp14="http://schemas.microsoft.com/office/word/2010/wordprocessingDrawing" xmlns:wp="http://schemas.openxmlformats.org/drawingml/2006/wordprocessingDrawing" xmlns:w10="urn:schemas-microsoft-com:office:word" xmlns:w="http://schemas.openxmlformats.org/wordprocessingml/2006/main" xmlns:w14="http://schemas.microsoft.com/office/word/2010/wordml" xmlns:w15="http://schemas.microsoft.com/office/word/2012/wordml" xmlns:w16cei="http://schemas.microsoft.com/office/word/2026/wordml/cei" xmlns:w16cex="http://schemas.microsoft.com/office/word/2018/wordml/cex" xmlns:w16cid="http://schemas.microsoft.com/office/word/2016/wordml/cid" xmlns:w16="http://schemas.microsoft.com/office/word/2018/wordml" xmlns:w16du="http://schemas.microsoft.com/office/word/2023/wordml/word16du" xmlns:w16sdtdh="http://schemas.microsoft.com/office/word/2020/wordml/sdtdatahash" xmlns:w16sdtfl="http://schemas.microsoft.com/office/word/2024/wordml/sdtformatlock" xmlns:w16se="http://schemas.microsoft.com/office/word/2015/wordml/symex" xmlns:wpg="http://schemas.microsoft.com/office/word/2010/wordprocessingGroup" xmlns:wpi="http://schemas.microsoft.com/office/word/2010/wordprocessingInk" xmlns:wne="http://schemas.microsoft.com/office/word/2006/wordml" xmlns:wps="http://schemas.microsoft.com/office/word/2010/wordprocessingShape" mc:Ignorable="w14 w15 w16se w16cid w16 w16cex w16sdtdh w16sdtfl w16du wp14">
+  <w:abstractNum w:abstractNumId="0" w15:restartNumberingAfterBreak="0">
+    <w:nsid w:val="09C74451"/>
+    <w:multiLevelType w:val="hybridMultilevel"/>
+    <w:tmpl w:val="3092BF50"/>
+    <w:lvl w:ilvl="0" w:tplc="04090001">
+      <w:start w:val="1"/>
+      <w:numFmt w:val="bullet"/>
+      <w:lvlText w:val=""/>
+      <w:lvlJc w:val="left"/>
+      <w:pPr>
+        <w:ind w:left="720" w:hanging="360"/>
+      </w:pPr>
+      <w:rPr>
+        <w:rFonts w:ascii="Symbol" w:hAnsi="Symbol" w:hint="default"/>
+      </w:rPr>
+    </w:lvl>
+    <w:lvl w:ilvl="1" w:tplc="04090003" w:tentative="1">
+      <w:start w:val="1"/>
+      <w:numFmt w:val="bullet"/>
+      <w:lvlText w:val="o"/>
+      <w:lvlJc w:val="left"/>
+      <w:pPr>
+        <w:ind w:left="1440" w:hanging="360"/>
+      </w:pPr>
+      <w:rPr>
+        <w:rFonts w:ascii="Courier New" w:hAnsi="Courier New" w:cs="Courier New" w:hint="default"/>
+      </w:rPr>
+    </w:lvl>
+    <w:lvl w:ilvl="2" w:tplc="04090005" w:tentative="1">
+      <w:start w:val="1"/>
+      <w:numFmt w:val="bullet"/>
+      <w:lvlText w:val=""/>
+      <w:lvlJc w:val="left"/>
+      <w:pPr>
+        <w:ind w:left="2160" w:hanging="360"/>
+      </w:pPr>
+      <w:rPr>
+        <w:rFonts w:ascii="Wingdings" w:hAnsi="Wingdings" w:hint="default"/>
+      </w:rPr>
+    </w:lvl>
+    <w:lvl w:ilvl="3" w:tplc="04090001" w:tentative="1">
+      <w:start w:val="1"/>
+      <w:numFmt w:val="bullet"/>
+      <w:lvlText w:val=""/>
+      <w:lvlJc w:val="left"/>
+      <w:pPr>
+        <w:ind w:left="2880" w:hanging="360"/>
+      </w:pPr>
+      <w:rPr>
+        <w:rFonts w:ascii="Symbol" w:hAnsi="Symbol" w:hint="default"/>
+      </w:rPr>
+    </w:lvl>
+    <w:lvl w:ilvl="4" w:tplc="04090003" w:tentative="1">
+      <w:start w:val="1"/>
+      <w:numFmt w:val="bullet"/>
+      <w:lvlText w:val="o"/>
+      <w:lvlJc w:val="left"/>
+      <w:pPr>
+        <w:ind w:left="3600" w:hanging="360"/>
+      </w:pPr>
+      <w:rPr>
+        <w:rFonts w:ascii="Courier New" w:hAnsi="Courier New" w:cs="Courier New" w:hint="default"/>
+      </w:rPr>
+    </w:lvl>
+    <w:lvl w:ilvl="5" w:tplc="04090005" w:tentative="1">
+      <w:start w:val="1"/>
+      <w:numFmt w:val="bullet"/>
+      <w:lvlText w:val=""/>
+      <w:lvlJc w:val="left"/>
+      <w:pPr>
+        <w:ind w:left="4320" w:hanging="360"/>
+      </w:pPr>
+      <w:rPr>
+        <w:rFonts w:ascii="Wingdings" w:hAnsi="Wingdings" w:hint="default"/>
+      </w:rPr>
+    </w:lvl>
+    <w:lvl w:ilvl="6" w:tplc="04090001" w:tentative="1">
+      <w:start w:val="1"/>
+      <w:numFmt w:val="bullet"/>
+      <w:lvlText w:val=""/>
+      <w:lvlJc w:val="left"/>
+      <w:pPr>
+        <w:ind w:left="5040" w:hanging="360"/>
+      </w:pPr>
+      <w:rPr>
+        <w:rFonts w:ascii="Symbol" w:hAnsi="Symbol" w:hint="default"/>
+      </w:rPr>
+    </w:lvl>
+    <w:lvl w:ilvl="7" w:tplc="04090003" w:tentative="1">
+      <w:start w:val="1"/>
+      <w:numFmt w:val="bullet"/>
+      <w:lvlText w:val="o"/>
+      <w:lvlJc w:val="left"/>
+      <w:pPr>
+        <w:ind w:left="5760" w:hanging="360"/>
+      </w:pPr>
+      <w:rPr>
+        <w:rFonts w:ascii="Courier New" w:hAnsi="Courier New" w:cs="Courier New" w:hint="default"/>
+      </w:rPr>
+    </w:lvl>
+    <w:lvl w:ilvl="8" w:tplc="04090005" w:tentative="1">
+      <w:start w:val="1"/>
+      <w:numFmt w:val="bullet"/>
+      <w:lvlText w:val=""/>
+      <w:lvlJc w:val="left"/>
+      <w:pPr>
+        <w:ind w:left="6480" w:hanging="360"/>
+      </w:pPr>
+      <w:rPr>
+        <w:rFonts w:ascii="Wingdings" w:hAnsi="Wingdings" w:hint="default"/>
+      </w:rPr>
+    </w:lvl>
+  </w:abstractNum>
+  <w:abstractNum w:abstractNumId="1" w15:restartNumberingAfterBreak="0">
+    <w:nsid w:val="1F955E4A"/>
+    <w:multiLevelType w:val="hybridMultilevel"/>
+    <w:tmpl w:val="21EA5600"/>
+    <w:lvl w:ilvl="0" w:tplc="04090001">
+      <w:start w:val="1"/>
+      <w:numFmt w:val="bullet"/>
+      <w:lvlText w:val=""/>
+      <w:lvlJc w:val="left"/>
+      <w:pPr>
+        <w:ind w:left="720" w:hanging="360"/>
+      </w:pPr>
+      <w:rPr>
+        <w:rFonts w:ascii="Symbol" w:hAnsi="Symbol" w:hint="default"/>
+      </w:rPr>
+    </w:lvl>
+    <w:lvl w:ilvl="1" w:tplc="04090003" w:tentative="1">
+      <w:start w:val="1"/>
+      <w:numFmt w:val="bullet"/>
+      <w:lvlText w:val="o"/>
+      <w:lvlJc w:val="left"/>
+      <w:pPr>
+        <w:ind w:left="1440" w:hanging="360"/>
+      </w:pPr>
+      <w:rPr>
+        <w:rFonts w:ascii="Courier New" w:hAnsi="Courier New" w:cs="Courier New" w:hint="default"/>
+      </w:rPr>
+    </w:lvl>
+    <w:lvl w:ilvl="2" w:tplc="04090005" w:tentative="1">
+      <w:start w:val="1"/>
+      <w:numFmt w:val="bullet"/>
+      <w:lvlText w:val=""/>
+      <w:lvlJc w:val="left"/>
+      <w:pPr>
+        <w:ind w:left="2160" w:hanging="360"/>
+      </w:pPr>
+      <w:rPr>
+        <w:rFonts w:ascii="Wingdings" w:hAnsi="Wingdings" w:hint="default"/>
+      </w:rPr>
+    </w:lvl>
+    <w:lvl w:ilvl="3" w:tplc="04090001" w:tentative="1">
+      <w:start w:val="1"/>
+      <w:numFmt w:val="bullet"/>
+      <w:lvlText w:val=""/>
+      <w:lvlJc w:val="left"/>
+      <w:pPr>
+        <w:ind w:left="2880" w:hanging="360"/>
+      </w:pPr>
+      <w:rPr>
+        <w:rFonts w:ascii="Symbol" w:hAnsi="Symbol" w:hint="default"/>
+      </w:rPr>
+    </w:lvl>
+    <w:lvl w:ilvl="4" w:tplc="04090003" w:tentative="1">
+      <w:start w:val="1"/>
+      <w:numFmt w:val="bullet"/>
+      <w:lvlText w:val="o"/>
+      <w:lvlJc w:val="left"/>
+      <w:pPr>
+        <w:ind w:left="3600" w:hanging="360"/>
+      </w:pPr>
+      <w:rPr>
+        <w:rFonts w:ascii="Courier New" w:hAnsi="Courier New" w:cs="Courier New" w:hint="default"/>
+      </w:rPr>
+    </w:lvl>
+    <w:lvl w:ilvl="5" w:tplc="04090005" w:tentative="1">
+      <w:start w:val="1"/>
+      <w:numFmt w:val="bullet"/>
+      <w:lvlText w:val=""/>
+      <w:lvlJc w:val="left"/>
+      <w:pPr>
+        <w:ind w:left="4320" w:hanging="360"/>
+      </w:pPr>
+      <w:rPr>
+        <w:rFonts w:ascii="Wingdings" w:hAnsi="Wingdings" w:hint="default"/>
+      </w:rPr>
+    </w:lvl>
+    <w:lvl w:ilvl="6" w:tplc="04090001" w:tentative="1">
+      <w:start w:val="1"/>
+      <w:numFmt w:val="bullet"/>
+      <w:lvlText w:val=""/>
+      <w:lvlJc w:val="left"/>
+      <w:pPr>
+        <w:ind w:left="5040" w:hanging="360"/>
+      </w:pPr>
+      <w:rPr>
+        <w:rFonts w:ascii="Symbol" w:hAnsi="Symbol" w:hint="default"/>
+      </w:rPr>
+    </w:lvl>
+    <w:lvl w:ilvl="7" w:tplc="04090003" w:tentative="1">
+      <w:start w:val="1"/>
+      <w:numFmt w:val="bullet"/>
+      <w:lvlText w:val="o"/>
+      <w:lvlJc w:val="left"/>
+      <w:pPr>
+        <w:ind w:left="5760" w:hanging="360"/>
+      </w:pPr>
+      <w:rPr>
+        <w:rFonts w:ascii="Courier New" w:hAnsi="Courier New" w:cs="Courier New" w:hint="default"/>
+      </w:rPr>
+    </w:lvl>
+    <w:lvl w:ilvl="8" w:tplc="04090005" w:tentative="1">
+      <w:start w:val="1"/>
+      <w:numFmt w:val="bullet"/>
+      <w:lvlText w:val=""/>
+      <w:lvlJc w:val="left"/>
+      <w:pPr>
+        <w:ind w:left="6480" w:hanging="360"/>
+      </w:pPr>
+      <w:rPr>
+        <w:rFonts w:ascii="Wingdings" w:hAnsi="Wingdings" w:hint="default"/>
+      </w:rPr>
+    </w:lvl>
+  </w:abstractNum>
+  <w:abstractNum w:abstractNumId="2" w15:restartNumberingAfterBreak="0">
+    <w:nsid w:val="35F11F44"/>
+    <w:multiLevelType w:val="hybridMultilevel"/>
+    <w:tmpl w:val="46662850"/>
+    <w:lvl w:ilvl="0" w:tplc="04090001">
+      <w:start w:val="1"/>
+      <w:numFmt w:val="bullet"/>
+      <w:lvlText w:val=""/>
+      <w:lvlJc w:val="left"/>
+      <w:pPr>
+        <w:ind w:left="720" w:hanging="360"/>
+      </w:pPr>
+      <w:rPr>
+        <w:rFonts w:ascii="Symbol" w:hAnsi="Symbol" w:hint="default"/>
+      </w:rPr>
+    </w:lvl>
+    <w:lvl w:ilvl="1" w:tplc="04090003" w:tentative="1">
+      <w:start w:val="1"/>
+      <w:numFmt w:val="bullet"/>
+      <w:lvlText w:val="o"/>
+      <w:lvlJc w:val="left"/>
+      <w:pPr>
+        <w:ind w:left="1440" w:hanging="360"/>
+      </w:pPr>
+      <w:rPr>
+        <w:rFonts w:ascii="Courier New" w:hAnsi="Courier New" w:cs="Courier New" w:hint="default"/>
+      </w:rPr>
+    </w:lvl>
+    <w:lvl w:ilvl="2" w:tplc="04090005" w:tentative="1">
+      <w:start w:val="1"/>
+      <w:numFmt w:val="bullet"/>
+      <w:lvlText w:val=""/>
+      <w:lvlJc w:val="left"/>
+      <w:pPr>
+        <w:ind w:left="2160" w:hanging="360"/>
+      </w:pPr>
+      <w:rPr>
+        <w:rFonts w:ascii="Wingdings" w:hAnsi="Wingdings" w:hint="default"/>
+      </w:rPr>
+    </w:lvl>
+    <w:lvl w:ilvl="3" w:tplc="04090001" w:tentative="1">
+      <w:start w:val="1"/>
+      <w:numFmt w:val="bullet"/>
+      <w:lvlText w:val=""/>
+      <w:lvlJc w:val="left"/>
+      <w:pPr>
+        <w:ind w:left="2880" w:hanging="360"/>
+      </w:pPr>
+      <w:rPr>
+        <w:rFonts w:ascii="Symbol" w:hAnsi="Symbol" w:hint="default"/>
+      </w:rPr>
+    </w:lvl>
+    <w:lvl w:ilvl="4" w:tplc="04090003" w:tentative="1">
+      <w:start w:val="1"/>
+      <w:numFmt w:val="bullet"/>
+      <w:lvlText w:val="o"/>
+      <w:lvlJc w:val="left"/>
+      <w:pPr>
+        <w:ind w:left="3600" w:hanging="360"/>
+      </w:pPr>
+      <w:rPr>
+        <w:rFonts w:ascii="Courier New" w:hAnsi="Courier New" w:cs="Courier New" w:hint="default"/>
+      </w:rPr>
+    </w:lvl>
+    <w:lvl w:ilvl="5" w:tplc="04090005" w:tentative="1">
+      <w:start w:val="1"/>
+      <w:numFmt w:val="bullet"/>
+      <w:lvlText w:val=""/>
+      <w:lvlJc w:val="left"/>
+      <w:pPr>
+        <w:ind w:left="4320" w:hanging="360"/>
+      </w:pPr>
+      <w:rPr>
+        <w:rFonts w:ascii="Wingdings" w:hAnsi="Wingdings" w:hint="default"/>
+      </w:rPr>
+    </w:lvl>
+    <w:lvl w:ilvl="6" w:tplc="04090001" w:tentative="1">
+      <w:start w:val="1"/>
+      <w:numFmt w:val="bullet"/>
+      <w:lvlText w:val=""/>
+      <w:lvlJc w:val="left"/>
+      <w:pPr>
+        <w:ind w:left="5040" w:hanging="360"/>
+      </w:pPr>
+      <w:rPr>
+        <w:rFonts w:ascii="Symbol" w:hAnsi="Symbol" w:hint="default"/>
+      </w:rPr>
+    </w:lvl>
+    <w:lvl w:ilvl="7" w:tplc="04090003" w:tentative="1">
+      <w:start w:val="1"/>
+      <w:numFmt w:val="bullet"/>
+      <w:lvlText w:val="o"/>
+      <w:lvlJc w:val="left"/>
+      <w:pPr>
+        <w:ind w:left="5760" w:hanging="360"/>
+      </w:pPr>
+      <w:rPr>
+        <w:rFonts w:ascii="Courier New" w:hAnsi="Courier New" w:cs="Courier New" w:hint="default"/>
+      </w:rPr>
+    </w:lvl>
+    <w:lvl w:ilvl="8" w:tplc="04090005" w:tentative="1">
+      <w:start w:val="1"/>
+      <w:numFmt w:val="bullet"/>
+      <w:lvlText w:val=""/>
+      <w:lvlJc w:val="left"/>
+      <w:pPr>
+        <w:ind w:left="6480" w:hanging="360"/>
+      </w:pPr>
+      <w:rPr>
+        <w:rFonts w:ascii="Wingdings" w:hAnsi="Wingdings" w:hint="default"/>
+      </w:rPr>
+    </w:lvl>
+  </w:abstractNum>
+  <w:abstractNum w:abstractNumId="3" w15:restartNumberingAfterBreak="0">
+    <w:nsid w:val="63713D95"/>
+    <w:multiLevelType w:val="hybridMultilevel"/>
+    <w:tmpl w:val="83E8B97E"/>
+    <w:lvl w:ilvl="0" w:tplc="04090001">
+      <w:start w:val="1"/>
+      <w:numFmt w:val="bullet"/>
+      <w:lvlText w:val=""/>
+      <w:lvlJc w:val="left"/>
+      <w:pPr>
+        <w:ind w:left="720" w:hanging="360"/>
+      </w:pPr>
+      <w:rPr>
+        <w:rFonts w:ascii="Symbol" w:hAnsi="Symbol" w:hint="default"/>
+      </w:rPr>
+    </w:lvl>
+    <w:lvl w:ilvl="1" w:tplc="04090003" w:tentative="1">
+      <w:start w:val="1"/>
+      <w:numFmt w:val="bullet"/>
+      <w:lvlText w:val="o"/>
+      <w:lvlJc w:val="left"/>
+      <w:pPr>
+        <w:ind w:left="1440" w:hanging="360"/>
+      </w:pPr>
+      <w:rPr>
+        <w:rFonts w:ascii="Courier New" w:hAnsi="Courier New" w:cs="Courier New" w:hint="default"/>
+      </w:rPr>
+    </w:lvl>
+    <w:lvl w:ilvl="2" w:tplc="04090005" w:tentative="1">
+      <w:start w:val="1"/>
+      <w:numFmt w:val="bullet"/>
+      <w:lvlText w:val=""/>
+      <w:lvlJc w:val="left"/>
+      <w:pPr>
+        <w:ind w:left="2160" w:hanging="360"/>
+      </w:pPr>
+      <w:rPr>
+        <w:rFonts w:ascii="Wingdings" w:hAnsi="Wingdings" w:hint="default"/>
+      </w:rPr>
+    </w:lvl>
+    <w:lvl w:ilvl="3" w:tplc="04090001" w:tentative="1">
+      <w:start w:val="1"/>
+      <w:numFmt w:val="bullet"/>
+      <w:lvlText w:val=""/>
+      <w:lvlJc w:val="left"/>
+      <w:pPr>
+        <w:ind w:left="2880" w:hanging="360"/>
+      </w:pPr>
+      <w:rPr>
+        <w:rFonts w:ascii="Symbol" w:hAnsi="Symbol" w:hint="default"/>
+      </w:rPr>
+    </w:lvl>
+    <w:lvl w:ilvl="4" w:tplc="04090003" w:tentative="1">
+      <w:start w:val="1"/>
+      <w:numFmt w:val="bullet"/>
+      <w:lvlText w:val="o"/>
+      <w:lvlJc w:val="left"/>
+      <w:pPr>
+        <w:ind w:left="3600" w:hanging="360"/>
+      </w:pPr>
+      <w:rPr>
+        <w:rFonts w:ascii="Courier New" w:hAnsi="Courier New" w:cs="Courier New" w:hint="default"/>
+      </w:rPr>
+    </w:lvl>
+    <w:lvl w:ilvl="5" w:tplc="04090005" w:tentative="1">
+      <w:start w:val="1"/>
+      <w:numFmt w:val="bullet"/>
+      <w:lvlText w:val=""/>
+      <w:lvlJc w:val="left"/>
+      <w:pPr>
+        <w:ind w:left="4320" w:hanging="360"/>
+      </w:pPr>
+      <w:rPr>
+        <w:rFonts w:ascii="Wingdings" w:hAnsi="Wingdings" w:hint="default"/>
+      </w:rPr>
+    </w:lvl>
+    <w:lvl w:ilvl="6" w:tplc="04090001" w:tentative="1">
+      <w:start w:val="1"/>
+      <w:numFmt w:val="bullet"/>
+      <w:lvlText w:val=""/>
+      <w:lvlJc w:val="left"/>
+      <w:pPr>
+        <w:ind w:left="5040" w:hanging="360"/>
+      </w:pPr>
+      <w:rPr>
+        <w:rFonts w:ascii="Symbol" w:hAnsi="Symbol" w:hint="default"/>
+      </w:rPr>
+    </w:lvl>
+    <w:lvl w:ilvl="7" w:tplc="04090003" w:tentative="1">
+      <w:start w:val="1"/>
+      <w:numFmt w:val="bullet"/>
+      <w:lvlText w:val="o"/>
+      <w:lvlJc w:val="left"/>
+      <w:pPr>
+        <w:ind w:left="5760" w:hanging="360"/>
+      </w:pPr>
+      <w:rPr>
+        <w:rFonts w:ascii="Courier New" w:hAnsi="Courier New" w:cs="Courier New" w:hint="default"/>
+      </w:rPr>
+    </w:lvl>
+    <w:lvl w:ilvl="8" w:tplc="04090005" w:tentative="1">
+      <w:start w:val="1"/>
+      <w:numFmt w:val="bullet"/>
+      <w:lvlText w:val=""/>
+      <w:lvlJc w:val="left"/>
+      <w:pPr>
+        <w:ind w:left="6480" w:hanging="360"/>
+      </w:pPr>
+      <w:rPr>
+        <w:rFonts w:ascii="Wingdings" w:hAnsi="Wingdings" w:hint="default"/>
+      </w:rPr>
+    </w:lvl>
+  </w:abstractNum>
+  <w:abstractNum w:abstractNumId="4" w15:restartNumberingAfterBreak="0">
+    <w:nsid w:val="63D05E98"/>
+    <w:multiLevelType w:val="hybridMultilevel"/>
+    <w:tmpl w:val="54E41E38"/>
+    <w:lvl w:ilvl="0" w:tplc="04090001">
+      <w:start w:val="1"/>
+      <w:numFmt w:val="bullet"/>
+      <w:lvlText w:val=""/>
+      <w:lvlJc w:val="left"/>
+      <w:pPr>
+        <w:ind w:left="720" w:hanging="360"/>
+      </w:pPr>
+      <w:rPr>
+        <w:rFonts w:ascii="Symbol" w:hAnsi="Symbol" w:hint="default"/>
+      </w:rPr>
+    </w:lvl>
+    <w:lvl w:ilvl="1" w:tplc="04090003" w:tentative="1">
+      <w:start w:val="1"/>
+      <w:numFmt w:val="bullet"/>
+      <w:lvlText w:val="o"/>
+      <w:lvlJc w:val="left"/>
+      <w:pPr>
+        <w:ind w:left="1440" w:hanging="360"/>
+      </w:pPr>
+      <w:rPr>
+        <w:rFonts w:ascii="Courier New" w:hAnsi="Courier New" w:cs="Courier New" w:hint="default"/>
+      </w:rPr>
+    </w:lvl>
+    <w:lvl w:ilvl="2" w:tplc="04090005" w:tentative="1">
+      <w:start w:val="1"/>
+      <w:numFmt w:val="bullet"/>
+      <w:lvlText w:val=""/>
+      <w:lvlJc w:val="left"/>
+      <w:pPr>
+        <w:ind w:left="2160" w:hanging="360"/>
+      </w:pPr>
+      <w:rPr>
+        <w:rFonts w:ascii="Wingdings" w:hAnsi="Wingdings" w:hint="default"/>
+      </w:rPr>
+    </w:lvl>
+    <w:lvl w:ilvl="3" w:tplc="04090001" w:tentative="1">
+      <w:start w:val="1"/>
+      <w:numFmt w:val="bullet"/>
+      <w:lvlText w:val=""/>
+      <w:lvlJc w:val="left"/>
+      <w:pPr>
+        <w:ind w:left="2880" w:hanging="360"/>
+      </w:pPr>
+      <w:rPr>
+        <w:rFonts w:ascii="Symbol" w:hAnsi="Symbol" w:hint="default"/>
+      </w:rPr>
+    </w:lvl>
+    <w:lvl w:ilvl="4" w:tplc="04090003" w:tentative="1">
+      <w:start w:val="1"/>
+      <w:numFmt w:val="bullet"/>
+      <w:lvlText w:val="o"/>
+      <w:lvlJc w:val="left"/>
+      <w:pPr>
+        <w:ind w:left="3600" w:hanging="360"/>
+      </w:pPr>
+      <w:rPr>
+        <w:rFonts w:ascii="Courier New" w:hAnsi="Courier New" w:cs="Courier New" w:hint="default"/>
+      </w:rPr>
+    </w:lvl>
+    <w:lvl w:ilvl="5" w:tplc="04090005" w:tentative="1">
+      <w:start w:val="1"/>
+      <w:numFmt w:val="bullet"/>
+      <w:lvlText w:val=""/>
+      <w:lvlJc w:val="left"/>
+      <w:pPr>
+        <w:ind w:left="4320" w:hanging="360"/>
+      </w:pPr>
+      <w:rPr>
+        <w:rFonts w:ascii="Wingdings" w:hAnsi="Wingdings" w:hint="default"/>
+      </w:rPr>
+    </w:lvl>
+    <w:lvl w:ilvl="6" w:tplc="04090001" w:tentative="1">
+      <w:start w:val="1"/>
+      <w:numFmt w:val="bullet"/>
+      <w:lvlText w:val=""/>
+      <w:lvlJc w:val="left"/>
+      <w:pPr>
+        <w:ind w:left="5040" w:hanging="360"/>
+      </w:pPr>
+      <w:rPr>
+        <w:rFonts w:ascii="Symbol" w:hAnsi="Symbol" w:hint="default"/>
+      </w:rPr>
+    </w:lvl>
+    <w:lvl w:ilvl="7" w:tplc="04090003" w:tentative="1">
+      <w:start w:val="1"/>
+      <w:numFmt w:val="bullet"/>
+      <w:lvlText w:val="o"/>
+      <w:lvlJc w:val="left"/>
+      <w:pPr>
+        <w:ind w:left="5760" w:hanging="360"/>
+      </w:pPr>
+      <w:rPr>
+        <w:rFonts w:ascii="Courier New" w:hAnsi="Courier New" w:cs="Courier New" w:hint="default"/>
+      </w:rPr>
+    </w:lvl>
+    <w:lvl w:ilvl="8" w:tplc="04090005" w:tentative="1">
+      <w:start w:val="1"/>
+      <w:numFmt w:val="bullet"/>
+      <w:lvlText w:val=""/>
+      <w:lvlJc w:val="left"/>
+      <w:pPr>
+        <w:ind w:left="6480" w:hanging="360"/>
+      </w:pPr>
+      <w:rPr>
+        <w:rFonts w:ascii="Wingdings" w:hAnsi="Wingdings" w:hint="default"/>
+      </w:rPr>
+    </w:lvl>
+  </w:abstractNum>
+  <w:num w:numId="1" w16cid:durableId="1986808984">
+    <w:abstractNumId w:val="2"/>
+  </w:num>
+  <w:num w:numId="2" w16cid:durableId="1986010450">
+    <w:abstractNumId w:val="0"/>
+  </w:num>
+  <w:num w:numId="3" w16cid:durableId="1379477111">
+    <w:abstractNumId w:val="4"/>
+  </w:num>
+  <w:num w:numId="4" w16cid:durableId="1306275871">
+    <w:abstractNumId w:val="3"/>
+  </w:num>
+  <w:num w:numId="5" w16cid:durableId="1744645273">
+    <w:abstractNumId w:val="1"/>
+  </w:num>
+</w:numbering>
 </file>
 
 <file path=word/styles.xml><?xml version="1.0" encoding="utf-8"?>
@@ -939,6 +2381,48 @@
       <w:spacing w:val="5"/>
     </w:rPr>
   </w:style>
+  <w:style w:type="paragraph" w:styleId="TOCHeading">
+    <w:name w:val="TOC Heading"/>
+    <w:basedOn w:val="Heading1"/>
+    <w:next w:val="Normal"/>
+    <w:uiPriority w:val="39"/>
+    <w:unhideWhenUsed/>
+    <w:qFormat/>
+    <w:rsid w:val="003B4570"/>
+    <w:pPr>
+      <w:spacing w:before="240" w:after="0" w:line="259" w:lineRule="auto"/>
+      <w:outlineLvl w:val="9"/>
+    </w:pPr>
+    <w:rPr>
+      <w:kern w:val="0"/>
+      <w:sz w:val="32"/>
+      <w:szCs w:val="32"/>
+      <w14:ligatures w14:val="none"/>
+    </w:rPr>
+  </w:style>
+  <w:style w:type="paragraph" w:styleId="TOC1">
+    <w:name w:val="toc 1"/>
+    <w:basedOn w:val="Normal"/>
+    <w:next w:val="Normal"/>
+    <w:autoRedefine/>
+    <w:uiPriority w:val="39"/>
+    <w:unhideWhenUsed/>
+    <w:rsid w:val="003B4570"/>
+    <w:pPr>
+      <w:spacing w:after="100"/>
+    </w:pPr>
+  </w:style>
+  <w:style w:type="character" w:styleId="Hyperlink">
+    <w:name w:val="Hyperlink"/>
+    <w:basedOn w:val="DefaultParagraphFont"/>
+    <w:uiPriority w:val="99"/>
+    <w:unhideWhenUsed/>
+    <w:rsid w:val="003B4570"/>
+    <w:rPr>
+      <w:color w:val="467886" w:themeColor="hyperlink"/>
+      <w:u w:val="single"/>
+    </w:rPr>
+  </w:style>
 </w:styles>
 </file>
 

</xml_diff>